<commit_message>
Add live-entertainment background to DCPA resume summary and education
Co-Authored-By: Claude Opus 5 <noreply@anthropic.com>
Claude-Session: https://claude.ai/code/session_012bgCHkXVGvrCAAv9cv5gL6
</commit_message>
<xml_diff>
--- a/applications/dcpa-associate-director-digital-marketing/Rotenberg Resume - DCPA - Associate Director of Digital Marketing.docx
+++ b/applications/dcpa-associate-director-digital-marketing/Rotenberg Resume - DCPA - Associate Director of Digital Marketing.docx
@@ -80,7 +80,7 @@
           <w:i w:val="0"/>
           <w:color w:val="1A1A1A"/>
         </w:rPr>
-        <w:t>Digital marketing strategist with 15+ years across agency, SaaS, and marketing operations, leading integrated campaigns spanning paid media, email, content, SEO, and analytics. Reads campaign performance as a business question rather than a platform one: what the data says, what is driving it, and what should change next. Led a team of onboarding specialists at Wix for two years, a team of 20 and later a team of 8, and developed sales training for tenured account executives, and has spent a decade advising executives and external partners where a recommendation has to be understood before it can be acted on. Denver metro based, currently building AI and automation systems that inform how search and discovery are shifting.</w:t>
+        <w:t>Digital marketing strategist with 15+ years across agency, SaaS, and marketing operations, leading integrated campaigns spanning paid media, email, content, SEO, and analytics. Reads campaign performance as a business question rather than a platform one: what the data says, what is driving it, and what should change next. Led a team of onboarding specialists at Wix for two years, a team of 20 and later a team of 8, and developed sales training for tenured account executives, and has spent a decade advising executives and external partners where a recommendation has to be understood before it can be acted on. Denver metro based, with early roots in live entertainment as a college roadie and venue worker, and currently building AI and automation systems that inform how search and discovery are shifting.</w:t>
       </w:r>
     </w:p>
     <w:p>
@@ -1124,6 +1124,20 @@
     </w:p>
     <w:p>
       <w:pPr>
+        <w:spacing w:after="30"/>
+      </w:pPr>
+      <w:r>
+        <w:rPr>
+          <w:rFonts w:ascii="Calibri" w:hAnsi="Calibri"/>
+          <w:b w:val="0"/>
+          <w:i w:val="0"/>
+          <w:color w:val="1A1A1A"/>
+        </w:rPr>
+        <w:t>Live entertainment background during college: roadie work and venue work at the Mishawaka Amphitheatre, Bellvue, CO</w:t>
+      </w:r>
+    </w:p>
+    <w:p>
+      <w:pPr>
         <w:spacing w:before="140" w:after="60"/>
         <w:pBdr>
           <w:bottom w:val="single" w:sz="6" w:space="2" w:color="163a5f"/>

</xml_diff>